<commit_message>
feat(chatbot): IA integrada en la app vía API route (DeepSeek), sin depender de n8n
- Nuevo API route POST /api/chatbot (server-side, sesión validada) que llama
  a DeepSeek con el system prompt; parseo defensivo en src/lib/chatbot.ts
- El chat del frontend usa /api/chatbot (funciona en local y en Vercel)
- Middleware: /api excluido del redirect de páginas
- Env: CHATBOT_API_KEY / CHATBOT_MODEL (clave nunca expuesta al cliente)
- Tests del parser (35 en total); README e informe actualizados (DeepSeek)
</commit_message>
<xml_diff>
--- a/docsInformeSoporte/informe-soporte.docx
+++ b/docsInformeSoporte/informe-soporte.docx
@@ -2509,7 +2509,7 @@
           <w:rPr>
             <w:rStyle w:val="Hyperlink"/>
           </w:rPr>
-          <w:t xml:space="preserve">Flujo n8n: Chatbot Nivel 1 con IA (Google Gemini)</w:t>
+          <w:t xml:space="preserve">Chatbot Nivel 1 con IA (DeepSeek)</w:t>
         </w:r>
       </w:hyperlink>
     </w:p>
@@ -3292,7 +3292,25 @@
           <w:rPr>
             <w:rStyle w:val="Hyperlink"/>
           </w:rPr>
-          <w:t xml:space="preserve">Consumo del Chatbot (Google Gemini 2.5 Flash)</w:t>
+          <w:t xml:space="preserve">Consumo del Chatbot (DeepSeek</w:t>
+        </w:r>
+        <w:r>
+          <w:rPr>
+            <w:rStyle w:val="Hyperlink"/>
+          </w:rPr>
+          <w:t xml:space="preserve"> </w:t>
+        </w:r>
+        <w:r>
+          <w:rPr>
+            <w:rStyle w:val="VerbatimChar"/>
+          </w:rPr>
+          <w:t xml:space="preserve">deepseek-chat</w:t>
+        </w:r>
+        <w:r>
+          <w:rPr>
+            <w:rStyle w:val="Hyperlink"/>
+          </w:rPr>
+          <w:t xml:space="preserve">)</w:t>
         </w:r>
       </w:hyperlink>
     </w:p>
@@ -8402,19 +8420,19 @@
                     <w:jc w:val="center"/>
                   </w:pPr>
                   <w:r>
-                    <w:t xml:space="preserve">Sistema n8n</w:t>
-                  </w:r>
-                </w:p>
-              </w:tc>
-              <w:tc>
-                <w:tcPr/>
-                <w:p>
-                  <w:pPr>
-                    <w:pStyle w:val="Compact"/>
-                    <w:jc w:val="center"/>
-                  </w:pPr>
-                  <w:r>
-                    <w:t xml:space="preserve">Motor de automatización que ejecuta el chatbot Nivel 1 con IA</w:t>
+                    <w:t xml:space="preserve">API de IA</w:t>
+                  </w:r>
+                </w:p>
+              </w:tc>
+              <w:tc>
+                <w:tcPr/>
+                <w:p>
+                  <w:pPr>
+                    <w:pStyle w:val="Compact"/>
+                    <w:jc w:val="center"/>
+                  </w:pPr>
+                  <w:r>
+                    <w:t xml:space="preserve">Servicio que ejecuta el chatbot Nivel 1 (DeepSeek)</w:t>
                   </w:r>
                 </w:p>
               </w:tc>
@@ -9681,7 +9699,7 @@
           <w:b/>
           <w:bCs/>
         </w:rPr>
-        <w:t xml:space="preserve">Google Gemini API</w:t>
+        <w:t xml:space="preserve">DeepSeek API</w:t>
       </w:r>
       <w:r>
         <w:t xml:space="preserve"> </w:t>
@@ -9696,7 +9714,7 @@
         <w:rPr>
           <w:rStyle w:val="VerbatimChar"/>
         </w:rPr>
-        <w:t xml:space="preserve">gemini-2.5-flash</w:t>
+        <w:t xml:space="preserve">deepseek-chat</w:t>
       </w:r>
       <w:r>
         <w:t xml:space="preserve">) como motor de IA del chatbot Nivel 1 (para resolver automáticamente consultas de los clientes).</w:t>
@@ -9801,7 +9819,7 @@
           <w:b/>
           <w:bCs/>
         </w:rPr>
-        <w:t xml:space="preserve">Configuración del chatbot (n8n):</w:t>
+        <w:t xml:space="preserve">Configuración del chatbot (API route):</w:t>
       </w:r>
     </w:p>
     <w:p>
@@ -9813,16 +9831,16 @@
         </w:numPr>
       </w:pPr>
       <w:r>
-        <w:t xml:space="preserve">Servicio: Google Gemini API (</w:t>
+        <w:t xml:space="preserve">Servicio: DeepSeek API (</w:t>
       </w:r>
       <w:r>
         <w:rPr>
           <w:rStyle w:val="VerbatimChar"/>
         </w:rPr>
-        <w:t xml:space="preserve">https://generativelanguage.googleapis.com</w:t>
-      </w:r>
-      <w:r>
-        <w:t xml:space="preserve">)</w:t>
+        <w:t xml:space="preserve">https://api.deepseek.com/chat/completions</w:t>
+      </w:r>
+      <w:r>
+        <w:t xml:space="preserve">, OpenAI-compatible)</w:t>
       </w:r>
     </w:p>
     <w:p>
@@ -9843,13 +9861,7 @@
         <w:rPr>
           <w:rStyle w:val="VerbatimChar"/>
         </w:rPr>
-        <w:t xml:space="preserve">gemini-2.5-flash</w:t>
-      </w:r>
-      <w:r>
-        <w:t xml:space="preserve"> </w:t>
-      </w:r>
-      <w:r>
-        <w:t xml:space="preserve">(thinkingBudget: 0 para ahorrar tokens)</w:t>
+        <w:t xml:space="preserve">deepseek-chat</w:t>
       </w:r>
     </w:p>
     <w:p>
@@ -9861,7 +9873,22 @@
         </w:numPr>
       </w:pPr>
       <w:r>
-        <w:t xml:space="preserve">Integración: nodo HTTP Request en el workflow n8n</w:t>
+        <w:t xml:space="preserve">Integración: API route server-side</w:t>
+      </w:r>
+      <w:r>
+        <w:t xml:space="preserve"> </w:t>
+      </w:r>
+      <w:r>
+        <w:rPr>
+          <w:rStyle w:val="VerbatimChar"/>
+        </w:rPr>
+        <w:t xml:space="preserve">src/app/api/chatbot/route.ts</w:t>
+      </w:r>
+      <w:r>
+        <w:t xml:space="preserve"> </w:t>
+      </w:r>
+      <w:r>
+        <w:t xml:space="preserve">(la clave no se expone al cliente)</w:t>
       </w:r>
     </w:p>
     <w:bookmarkEnd w:id="48"/>
@@ -12565,7 +12592,7 @@
               <a:graphicData uri="http://schemas.openxmlformats.org/drawingml/2006/picture">
                 <pic:pic>
                   <pic:nvPicPr>
-                    <pic:cNvPr descr="/tmp/tmp9qb_82x6/img-0.png" id="64" name="Picture"/>
+                    <pic:cNvPr descr="/tmp/tmpemujarvy/img-0.png" id="64" name="Picture"/>
                     <pic:cNvPicPr>
                       <a:picLocks noChangeArrowheads="1" noChangeAspect="1"/>
                     </pic:cNvPicPr>
@@ -12630,7 +12657,7 @@
               <a:graphicData uri="http://schemas.openxmlformats.org/drawingml/2006/picture">
                 <pic:pic>
                   <pic:nvPicPr>
-                    <pic:cNvPr descr="/tmp/tmp9qb_82x6/img-1.png" id="68" name="Picture"/>
+                    <pic:cNvPr descr="/tmp/tmpemujarvy/img-1.png" id="68" name="Picture"/>
                     <pic:cNvPicPr>
                       <a:picLocks noChangeArrowheads="1" noChangeAspect="1"/>
                     </pic:cNvPicPr>
@@ -12695,7 +12722,7 @@
               <a:graphicData uri="http://schemas.openxmlformats.org/drawingml/2006/picture">
                 <pic:pic>
                   <pic:nvPicPr>
-                    <pic:cNvPr descr="/tmp/tmp9qb_82x6/img-2.png" id="72" name="Picture"/>
+                    <pic:cNvPr descr="/tmp/tmpemujarvy/img-2.png" id="72" name="Picture"/>
                     <pic:cNvPicPr>
                       <a:picLocks noChangeArrowheads="1" noChangeAspect="1"/>
                     </pic:cNvPicPr>
@@ -12733,7 +12760,7 @@
         <w:pStyle w:val="ImageCaption"/>
       </w:pPr>
       <w:r>
-        <w:t xml:space="preserve">Figura 4: Chat en vivo con el chatbot de Nivel 1 (Google Gemini)</w:t>
+        <w:t xml:space="preserve">Figura 4: Chat en vivo con el chatbot de Nivel 1 (IA)</w:t>
       </w:r>
     </w:p>
     <w:bookmarkEnd w:id="73"/>
@@ -12760,7 +12787,7 @@
               <a:graphicData uri="http://schemas.openxmlformats.org/drawingml/2006/picture">
                 <pic:pic>
                   <pic:nvPicPr>
-                    <pic:cNvPr descr="/tmp/tmp9qb_82x6/img-3.png" id="76" name="Picture"/>
+                    <pic:cNvPr descr="/tmp/tmpemujarvy/img-3.png" id="76" name="Picture"/>
                     <pic:cNvPicPr>
                       <a:picLocks noChangeArrowheads="1" noChangeAspect="1"/>
                     </pic:cNvPicPr>
@@ -13075,7 +13102,7 @@
               <a:graphicData uri="http://schemas.openxmlformats.org/drawingml/2006/picture">
                 <pic:pic>
                   <pic:nvPicPr>
-                    <pic:cNvPr descr="/tmp/tmp9qb_82x6/img-4.png" id="81" name="Picture"/>
+                    <pic:cNvPr descr="/tmp/tmpemujarvy/img-4.png" id="81" name="Picture"/>
                     <pic:cNvPicPr>
                       <a:picLocks noChangeArrowheads="1" noChangeAspect="1"/>
                     </pic:cNvPicPr>
@@ -13140,7 +13167,7 @@
               <a:graphicData uri="http://schemas.openxmlformats.org/drawingml/2006/picture">
                 <pic:pic>
                   <pic:nvPicPr>
-                    <pic:cNvPr descr="/tmp/tmp9qb_82x6/img-5.png" id="85" name="Picture"/>
+                    <pic:cNvPr descr="/tmp/tmpemujarvy/img-5.png" id="85" name="Picture"/>
                     <pic:cNvPicPr>
                       <a:picLocks noChangeArrowheads="1" noChangeAspect="1"/>
                     </pic:cNvPicPr>
@@ -13206,7 +13233,7 @@
         <w:pStyle w:val="FirstParagraph"/>
       </w:pPr>
       <w:r>
-        <w:t xml:space="preserve">La aplicación sigue una arquitectura serverless/moderna utilizando Supabase como backend completo (Base de datos + Auth + Realtime + Edge Functions), Next.js como frontend, y n8n (Docker self-hosted) como motor de automatización.</w:t>
+        <w:t xml:space="preserve">La aplicación sigue una arquitectura serverless/moderna utilizando Supabase como backend completo (Base de datos + Auth + Realtime + Edge Functions), Next.js como frontend y un API route server-side para el chatbot con IA (n8n se conserva como alternativa opcional).</w:t>
       </w:r>
     </w:p>
     <w:bookmarkEnd w:id="88"/>
@@ -13670,7 +13697,7 @@
               <a:graphicData uri="http://schemas.openxmlformats.org/drawingml/2006/picture">
                 <pic:pic>
                   <pic:nvPicPr>
-                    <pic:cNvPr descr="/tmp/tmp9qb_82x6/img-6.png" id="97" name="Picture"/>
+                    <pic:cNvPr descr="/tmp/tmpemujarvy/img-6.png" id="97" name="Picture"/>
                     <pic:cNvPicPr>
                       <a:picLocks noChangeArrowheads="1" noChangeAspect="1"/>
                     </pic:cNvPicPr>
@@ -13968,19 +13995,28 @@
                     <w:jc w:val="center"/>
                   </w:pPr>
                   <w:r>
-                    <w:t xml:space="preserve">n8n (Docker self-hosted)</w:t>
-                  </w:r>
-                </w:p>
-              </w:tc>
-              <w:tc>
-                <w:tcPr/>
-                <w:p>
-                  <w:pPr>
-                    <w:pStyle w:val="Compact"/>
-                    <w:jc w:val="center"/>
-                  </w:pPr>
-                  <w:r>
-                    <w:t xml:space="preserve">No-code/low-code, webhooks nativos, integración con Supabase</w:t>
+                    <w:t xml:space="preserve">PostgreSQL triggers +</w:t>
+                  </w:r>
+                  <w:r>
+                    <w:t xml:space="preserve"> </w:t>
+                  </w:r>
+                  <w:r>
+                    <w:rPr>
+                      <w:rStyle w:val="VerbatimChar"/>
+                    </w:rPr>
+                    <w:t xml:space="preserve">pg_cron</w:t>
+                  </w:r>
+                </w:p>
+              </w:tc>
+              <w:tc>
+                <w:tcPr/>
+                <w:p>
+                  <w:pPr>
+                    <w:pStyle w:val="Compact"/>
+                    <w:jc w:val="center"/>
+                  </w:pPr>
+                  <w:r>
+                    <w:t xml:space="preserve">Procesos de datos nativos en la base de datos (sin dependencias externas)</w:t>
                   </w:r>
                 </w:p>
               </w:tc>
@@ -14006,19 +14042,37 @@
                     <w:jc w:val="center"/>
                   </w:pPr>
                   <w:r>
-                    <w:t xml:space="preserve">Google Gemini API (gemini-2.5-flash)</w:t>
-                  </w:r>
-                </w:p>
-              </w:tc>
-              <w:tc>
-                <w:tcPr/>
-                <w:p>
-                  <w:pPr>
-                    <w:pStyle w:val="Compact"/>
-                    <w:jc w:val="center"/>
-                  </w:pPr>
-                  <w:r>
-                    <w:t xml:space="preserve">Modelo gratuito para chatbot Nivel 1 y procesamiento de texto</w:t>
+                    <w:t xml:space="preserve">DeepSeek API (</w:t>
+                  </w:r>
+                  <w:r>
+                    <w:rPr>
+                      <w:rStyle w:val="VerbatimChar"/>
+                    </w:rPr>
+                    <w:t xml:space="preserve">deepseek-chat</w:t>
+                  </w:r>
+                  <w:r>
+                    <w:t xml:space="preserve">)</w:t>
+                  </w:r>
+                </w:p>
+              </w:tc>
+              <w:tc>
+                <w:tcPr/>
+                <w:p>
+                  <w:pPr>
+                    <w:pStyle w:val="Compact"/>
+                    <w:jc w:val="center"/>
+                  </w:pPr>
+                  <w:r>
+                    <w:t xml:space="preserve">Modelo de lenguaje para el chatbot Nivel 1, llamado desde el API route</w:t>
+                  </w:r>
+                  <w:r>
+                    <w:t xml:space="preserve"> </w:t>
+                  </w:r>
+                  <w:r>
+                    <w:rPr>
+                      <w:rStyle w:val="VerbatimChar"/>
+                    </w:rPr>
+                    <w:t xml:space="preserve">/api/chatbot</w:t>
                   </w:r>
                 </w:p>
               </w:tc>
@@ -17144,7 +17198,7 @@
         <w:t xml:space="preserve"> </w:t>
       </w:r>
       <w:r>
-        <w:t xml:space="preserve">→ ejecutado en</w:t>
+        <w:t xml:space="preserve">→ ejecutado</w:t>
       </w:r>
       <w:r>
         <w:t xml:space="preserve"> </w:t>
@@ -17154,13 +17208,22 @@
           <w:b/>
           <w:bCs/>
         </w:rPr>
-        <w:t xml:space="preserve">n8n</w:t>
+        <w:t xml:space="preserve">dentro de la aplicación</w:t>
       </w:r>
       <w:r>
         <w:t xml:space="preserve"> </w:t>
       </w:r>
       <w:r>
-        <w:t xml:space="preserve">(Docker self-hosted), porque requiere orquestar una llamada externa a la API de Google Gemini.</w:t>
+        <w:t xml:space="preserve">en un API route de Next.js (</w:t>
+      </w:r>
+      <w:r>
+        <w:rPr>
+          <w:rStyle w:val="VerbatimChar"/>
+        </w:rPr>
+        <w:t xml:space="preserve">/api/chatbot</w:t>
+      </w:r>
+      <w:r>
+        <w:t xml:space="preserve">, server-side), que llama a la API del modelo (DeepSeek) sin exponer la clave al cliente. (n8n se mantiene como alternativa opcional.)</w:t>
       </w:r>
     </w:p>
     <w:p>
@@ -17228,7 +17291,7 @@
           <w:b/>
           <w:bCs/>
         </w:rPr>
-        <w:t xml:space="preserve">la IA vive en n8n, los procesos de datos viven en la base de datos</w:t>
+        <w:t xml:space="preserve">la IA vive en el backend de la app, los procesos de datos viven en la base de datos</w:t>
       </w:r>
       <w:r>
         <w:t xml:space="preserve">.</w:t>
@@ -17256,7 +17319,7 @@
         <w:pStyle w:val="ImageCaption"/>
       </w:pPr>
       <w:r>
-        <w:t xml:space="preserve">Figura 11: Arquitectura de automatizaciones: n8n + Supabase nativo</w:t>
+        <w:t xml:space="preserve">Figura 11: Arquitectura de automatizaciones: API route de IA + Supabase nativo</w:t>
       </w:r>
     </w:p>
     <w:bookmarkEnd w:id="114"/>
@@ -17266,7 +17329,7 @@
         <w:pStyle w:val="Heading2"/>
       </w:pPr>
       <w:r>
-        <w:t xml:space="preserve">9.2 Flujo n8n: Chatbot Nivel 1 con IA (Google Gemini)</w:t>
+        <w:t xml:space="preserve">9.2 Chatbot Nivel 1 con IA (DeepSeek)</w:t>
       </w:r>
     </w:p>
     <w:p>
@@ -17274,7 +17337,7 @@
         <w:pStyle w:val="FirstParagraph"/>
       </w:pPr>
       <w:r>
-        <w:t xml:space="preserve">El único workflow activo en n8n es el chatbot, que integra</w:t>
+        <w:t xml:space="preserve">El chatbot integra</w:t>
       </w:r>
       <w:r>
         <w:t xml:space="preserve"> </w:t>
@@ -17300,7 +17363,7 @@
           <w:b/>
           <w:bCs/>
         </w:rPr>
-        <w:t xml:space="preserve">Google Gemini</w:t>
+        <w:t xml:space="preserve">DeepSeek</w:t>
       </w:r>
       <w:r>
         <w:t xml:space="preserve"> </w:t>
@@ -17315,10 +17378,22 @@
         <w:rPr>
           <w:rStyle w:val="VerbatimChar"/>
         </w:rPr>
-        <w:t xml:space="preserve">gemini-2.5-flash</w:t>
-      </w:r>
-      <w:r>
-        <w:t xml:space="preserve">). A diferencia de un chatbot basado en expresiones regulares, este clasifica la intención del usuario y genera respuestas contextuales usando un modelo de lenguaje.</w:t>
+        <w:t xml:space="preserve">deepseek-chat</w:t>
+      </w:r>
+      <w:r>
+        <w:t xml:space="preserve">, OpenAI-compatible) desde el API route</w:t>
+      </w:r>
+      <w:r>
+        <w:t xml:space="preserve"> </w:t>
+      </w:r>
+      <w:r>
+        <w:rPr>
+          <w:rStyle w:val="VerbatimChar"/>
+        </w:rPr>
+        <w:t xml:space="preserve">src/app/api/chatbot/route.ts</w:t>
+      </w:r>
+      <w:r>
+        <w:t xml:space="preserve">. A diferencia de un chatbot basado en expresiones regulares, clasifica la intención del usuario y genera respuestas contextuales usando un modelo de lenguaje.</w:t>
       </w:r>
     </w:p>
     <w:tbl>
@@ -17388,19 +17463,19 @@
                     <w:jc w:val="center"/>
                   </w:pPr>
                   <w:r>
-                    <w:t xml:space="preserve">Trigger</w:t>
-                  </w:r>
-                </w:p>
-              </w:tc>
-              <w:tc>
-                <w:tcPr/>
-                <w:p>
-                  <w:pPr>
-                    <w:pStyle w:val="Compact"/>
-                    <w:jc w:val="center"/>
-                  </w:pPr>
-                  <w:r>
-                    <w:t xml:space="preserve">Webhook POST</w:t>
+                    <w:t xml:space="preserve">Entrada</w:t>
+                  </w:r>
+                </w:p>
+              </w:tc>
+              <w:tc>
+                <w:tcPr/>
+                <w:p>
+                  <w:pPr>
+                    <w:pStyle w:val="Compact"/>
+                    <w:jc w:val="center"/>
+                  </w:pPr>
+                  <w:r>
+                    <w:t xml:space="preserve">POST</w:t>
                   </w:r>
                   <w:r>
                     <w:t xml:space="preserve"> </w:t>
@@ -17409,39 +17484,13 @@
                     <w:rPr>
                       <w:rStyle w:val="VerbatimChar"/>
                     </w:rPr>
-                    <w:t xml:space="preserve">/webhook/chatbot</w:t>
+                    <w:t xml:space="preserve">/api/chatbot</w:t>
                   </w:r>
                   <w:r>
                     <w:t xml:space="preserve"> </w:t>
                   </w:r>
                   <w:r>
-                    <w:t xml:space="preserve">desde el frontend al enviar un mensaje</w:t>
-                  </w:r>
-                </w:p>
-              </w:tc>
-            </w:tr>
-            <w:tr>
-              <w:tc>
-                <w:tcPr/>
-                <w:p>
-                  <w:pPr>
-                    <w:pStyle w:val="Compact"/>
-                    <w:jc w:val="center"/>
-                  </w:pPr>
-                  <w:r>
-                    <w:t xml:space="preserve">Entrada</w:t>
-                  </w:r>
-                </w:p>
-              </w:tc>
-              <w:tc>
-                <w:tcPr/>
-                <w:p>
-                  <w:pPr>
-                    <w:pStyle w:val="Compact"/>
-                    <w:jc w:val="center"/>
-                  </w:pPr>
-                  <w:r>
-                    <w:t xml:space="preserve">JSON con: message, session_id, user_id</w:t>
+                    <w:t xml:space="preserve">con JSON: message, session_id, user_id (requiere sesión)</w:t>
                   </w:r>
                 </w:p>
               </w:tc>
@@ -17471,19 +17520,19 @@
                     <w:jc w:val="center"/>
                   </w:pPr>
                   <w:r>
-                    <w:t xml:space="preserve">Recibir mensaje por webhook</w:t>
+                    <w:t xml:space="preserve">Validar sesión y mensaje</w:t>
                   </w:r>
                   <w:r>
                     <w:br/>
                   </w:r>
                   <w:r>
-                    <w:t xml:space="preserve">2. Enviar mensaje + system instruction a Google Gemini API</w:t>
+                    <w:t xml:space="preserve">2. Enviar system prompt + mensaje a la API del modelo</w:t>
                   </w:r>
                   <w:r>
                     <w:br/>
                   </w:r>
                   <w:r>
-                    <w:t xml:space="preserve">3. Recibir respuesta JSON del modelo</w:t>
+                    <w:t xml:space="preserve">3. Recibir respuesta JSON</w:t>
                   </w:r>
                   <w:r>
                     <w:br/>
@@ -17495,7 +17544,7 @@
                     <w:br/>
                   </w:r>
                   <w:r>
-                    <w:t xml:space="preserve">5. Responder al frontend</w:t>
+                    <w:t xml:space="preserve">5. Devolver al frontend</w:t>
                   </w:r>
                 </w:p>
               </w:tc>
@@ -17547,7 +17596,7 @@
                     <w:jc w:val="center"/>
                   </w:pPr>
                   <w:r>
-                    <w:t xml:space="preserve">Google Gemini</w:t>
+                    <w:t xml:space="preserve">DeepSeek</w:t>
                   </w:r>
                   <w:r>
                     <w:t xml:space="preserve"> </w:t>
@@ -17556,13 +17605,13 @@
                     <w:rPr>
                       <w:rStyle w:val="VerbatimChar"/>
                     </w:rPr>
-                    <w:t xml:space="preserve">gemini-2.5-flash</w:t>
+                    <w:t xml:space="preserve">deepseek-chat</w:t>
                   </w:r>
                   <w:r>
                     <w:t xml:space="preserve"> </w:t>
                   </w:r>
                   <w:r>
-                    <w:t xml:space="preserve">(thinking mode desactivado para ahorrar tokens)</w:t>
+                    <w:t xml:space="preserve">(API OpenAI-compatible, tiempo de espera 12s)</w:t>
                   </w:r>
                 </w:p>
               </w:tc>
@@ -17588,19 +17637,25 @@
                     <w:jc w:val="center"/>
                   </w:pPr>
                   <w:r>
-                    <w:t xml:space="preserve">Timeout 10s → fallback</w:t>
+                    <w:t xml:space="preserve">Sin clave → 503 fallback</w:t>
                   </w:r>
                   <w:r>
                     <w:br/>
                   </w:r>
                   <w:r>
-                    <w:t xml:space="preserve">API no responde → mensaje amigable</w:t>
+                    <w:t xml:space="preserve">Timeout → mensaje amigable</w:t>
                   </w:r>
                   <w:r>
                     <w:br/>
                   </w:r>
                   <w:r>
-                    <w:t xml:space="preserve">JSON inválido → extracción defensiva</w:t>
+                    <w:t xml:space="preserve">Error del modelo → 502</w:t>
+                  </w:r>
+                  <w:r>
+                    <w:br/>
+                  </w:r>
+                  <w:r>
+                    <w:t xml:space="preserve">JSON inválido → extracción defensiva con texto plano</w:t>
                   </w:r>
                 </w:p>
               </w:tc>
@@ -17615,7 +17670,7 @@
         <w:pStyle w:val="ImageCaption"/>
       </w:pPr>
       <w:r>
-        <w:t xml:space="preserve">Tabla 21: Flujo del chatbot Nivel 1 con Google Gemini</w:t>
+        <w:t xml:space="preserve">Tabla 21: Flujo del chatbot Nivel 1 con DeepSeek</w:t>
       </w:r>
     </w:p>
     <w:p>
@@ -17632,7 +17687,7 @@
               <a:graphicData uri="http://schemas.openxmlformats.org/drawingml/2006/picture">
                 <pic:pic>
                   <pic:nvPicPr>
-                    <pic:cNvPr descr="/tmp/tmp9qb_82x6/img-7.png" id="117" name="Picture"/>
+                    <pic:cNvPr descr="/tmp/tmpemujarvy/img-7.png" id="117" name="Picture"/>
                     <pic:cNvPicPr>
                       <a:picLocks noChangeArrowheads="1" noChangeAspect="1"/>
                     </pic:cNvPicPr>
@@ -20436,7 +20491,7 @@
         </w:numPr>
       </w:pPr>
       <w:r>
-        <w:t xml:space="preserve">Descripción de las automatizaciones (1 n8n chatbot + 3 Supabase nativos)</w:t>
+        <w:t xml:space="preserve">Descripción de las automatizaciones (1 chatbot IA + 3 Supabase nativos)</w:t>
       </w:r>
     </w:p>
     <w:p>
@@ -20504,7 +20559,7 @@
               <a:graphicData uri="http://schemas.openxmlformats.org/drawingml/2006/picture">
                 <pic:pic>
                   <pic:nvPicPr>
-                    <pic:cNvPr descr="/tmp/tmp9qb_82x6/img-8.png" id="131" name="Picture"/>
+                    <pic:cNvPr descr="/tmp/tmpemujarvy/img-8.png" id="131" name="Picture"/>
                     <pic:cNvPicPr>
                       <a:picLocks noChangeArrowheads="1" noChangeAspect="1"/>
                     </pic:cNvPicPr>
@@ -20569,7 +20624,7 @@
               <a:graphicData uri="http://schemas.openxmlformats.org/drawingml/2006/picture">
                 <pic:pic>
                   <pic:nvPicPr>
-                    <pic:cNvPr descr="/tmp/tmp9qb_82x6/img-9.png" id="135" name="Picture"/>
+                    <pic:cNvPr descr="/tmp/tmpemujarvy/img-9.png" id="135" name="Picture"/>
                     <pic:cNvPicPr>
                       <a:picLocks noChangeArrowheads="1" noChangeAspect="1"/>
                     </pic:cNvPicPr>
@@ -20634,7 +20689,7 @@
               <a:graphicData uri="http://schemas.openxmlformats.org/drawingml/2006/picture">
                 <pic:pic>
                   <pic:nvPicPr>
-                    <pic:cNvPr descr="/tmp/tmp9qb_82x6/img-10.png" id="139" name="Picture"/>
+                    <pic:cNvPr descr="/tmp/tmpemujarvy/img-10.png" id="139" name="Picture"/>
                     <pic:cNvPicPr>
                       <a:picLocks noChangeArrowheads="1" noChangeAspect="1"/>
                     </pic:cNvPicPr>
@@ -20699,7 +20754,7 @@
               <a:graphicData uri="http://schemas.openxmlformats.org/drawingml/2006/picture">
                 <pic:pic>
                   <pic:nvPicPr>
-                    <pic:cNvPr descr="/tmp/tmp9qb_82x6/img-11.png" id="143" name="Picture"/>
+                    <pic:cNvPr descr="/tmp/tmpemujarvy/img-11.png" id="143" name="Picture"/>
                     <pic:cNvPicPr>
                       <a:picLocks noChangeArrowheads="1" noChangeAspect="1"/>
                     </pic:cNvPicPr>
@@ -20764,7 +20819,7 @@
               <a:graphicData uri="http://schemas.openxmlformats.org/drawingml/2006/picture">
                 <pic:pic>
                   <pic:nvPicPr>
-                    <pic:cNvPr descr="/tmp/tmp9qb_82x6/img-12.png" id="147" name="Picture"/>
+                    <pic:cNvPr descr="/tmp/tmpemujarvy/img-12.png" id="147" name="Picture"/>
                     <pic:cNvPicPr>
                       <a:picLocks noChangeArrowheads="1" noChangeAspect="1"/>
                     </pic:cNvPicPr>
@@ -20802,7 +20857,7 @@
         <w:pStyle w:val="ImageCaption"/>
       </w:pPr>
       <w:r>
-        <w:t xml:space="preserve">Figura 16: Interfaz de chat con chatbot Google Gemini</w:t>
+        <w:t xml:space="preserve">Figura 16: Interfaz de chat con el chatbot IA (DeepSeek)</w:t>
       </w:r>
     </w:p>
     <w:bookmarkEnd w:id="148"/>
@@ -20829,7 +20884,7 @@
               <a:graphicData uri="http://schemas.openxmlformats.org/drawingml/2006/picture">
                 <pic:pic>
                   <pic:nvPicPr>
-                    <pic:cNvPr descr="/tmp/tmp9qb_82x6/img-13.png" id="151" name="Picture"/>
+                    <pic:cNvPr descr="/tmp/tmpemujarvy/img-13.png" id="151" name="Picture"/>
                     <pic:cNvPicPr>
                       <a:picLocks noChangeArrowheads="1" noChangeAspect="1"/>
                     </pic:cNvPicPr>
@@ -20894,7 +20949,7 @@
               <a:graphicData uri="http://schemas.openxmlformats.org/drawingml/2006/picture">
                 <pic:pic>
                   <pic:nvPicPr>
-                    <pic:cNvPr descr="/tmp/tmp9qb_82x6/img-14.png" id="155" name="Picture"/>
+                    <pic:cNvPr descr="/tmp/tmpemujarvy/img-14.png" id="155" name="Picture"/>
                     <pic:cNvPicPr>
                       <a:picLocks noChangeArrowheads="1" noChangeAspect="1"/>
                     </pic:cNvPicPr>
@@ -20959,7 +21014,7 @@
               <a:graphicData uri="http://schemas.openxmlformats.org/drawingml/2006/picture">
                 <pic:pic>
                   <pic:nvPicPr>
-                    <pic:cNvPr descr="/tmp/tmp9qb_82x6/img-15.png" id="159" name="Picture"/>
+                    <pic:cNvPr descr="/tmp/tmpemujarvy/img-15.png" id="159" name="Picture"/>
                     <pic:cNvPicPr>
                       <a:picLocks noChangeArrowheads="1" noChangeAspect="1"/>
                     </pic:cNvPicPr>
@@ -21024,7 +21079,7 @@
               <a:graphicData uri="http://schemas.openxmlformats.org/drawingml/2006/picture">
                 <pic:pic>
                   <pic:nvPicPr>
-                    <pic:cNvPr descr="/tmp/tmp9qb_82x6/img-16.png" id="163" name="Picture"/>
+                    <pic:cNvPr descr="/tmp/tmpemujarvy/img-16.png" id="163" name="Picture"/>
                     <pic:cNvPicPr>
                       <a:picLocks noChangeArrowheads="1" noChangeAspect="1"/>
                     </pic:cNvPicPr>
@@ -21089,7 +21144,7 @@
               <a:graphicData uri="http://schemas.openxmlformats.org/drawingml/2006/picture">
                 <pic:pic>
                   <pic:nvPicPr>
-                    <pic:cNvPr descr="/tmp/tmp9qb_82x6/img-17.png" id="167" name="Picture"/>
+                    <pic:cNvPr descr="/tmp/tmpemujarvy/img-17.png" id="167" name="Picture"/>
                     <pic:cNvPicPr>
                       <a:picLocks noChangeArrowheads="1" noChangeAspect="1"/>
                     </pic:cNvPicPr>
@@ -21167,7 +21222,16 @@
         <w:pStyle w:val="BodyText"/>
       </w:pPr>
       <w:r>
-        <w:t xml:space="preserve">La aplicación está desplegada en Vercel (Next.js) y consume la base de datos Supabase y el workflow del chatbot en n8n.</w:t>
+        <w:t xml:space="preserve">La aplicación está desplegada en Vercel (Next.js) y consume la base de datos Supabase y el API route del chatbot (</w:t>
+      </w:r>
+      <w:r>
+        <w:rPr>
+          <w:rStyle w:val="VerbatimChar"/>
+        </w:rPr>
+        <w:t xml:space="preserve">/api/chatbot</w:t>
+      </w:r>
+      <w:r>
+        <w:t xml:space="preserve">).</w:t>
       </w:r>
     </w:p>
     <w:bookmarkEnd w:id="170"/>
@@ -21254,7 +21318,7 @@
         <w:t xml:space="preserve"> </w:t>
       </w:r>
       <w:r>
-        <w:t xml:space="preserve">Login/registro, creación de ticket, chat con el chatbot (Gemini), vista del agente y panel de administración.</w:t>
+        <w:t xml:space="preserve">Login/registro, creación de ticket, chat con el chatbot (IA), vista del agente y panel de administración.</w:t>
       </w:r>
     </w:p>
     <w:p>
@@ -21276,7 +21340,7 @@
         <w:t xml:space="preserve"> </w:t>
       </w:r>
       <w:r>
-        <w:t xml:space="preserve">Chatbot n8n (Google Gemini) y las automatizaciones SQL nativas.</w:t>
+        <w:t xml:space="preserve">Chatbot IA (DeepSeek) y las automatizaciones SQL nativas.</w:t>
       </w:r>
     </w:p>
     <w:p>
@@ -21445,13 +21509,22 @@
           <w:b/>
           <w:bCs/>
         </w:rPr>
-        <w:t xml:space="preserve">Chatbot (n8n + Gemini):</w:t>
+        <w:t xml:space="preserve">Chatbot (DeepSeek):</w:t>
       </w:r>
       <w:r>
         <w:t xml:space="preserve"> </w:t>
       </w:r>
       <w:r>
-        <w:t xml:space="preserve">Cada respuesta del chatbot se mide con el campo</w:t>
+        <w:t xml:space="preserve">Cada respuesta del chatbot incluye el conteo de tokens (</w:t>
+      </w:r>
+      <w:r>
+        <w:rPr>
+          <w:rStyle w:val="VerbatimChar"/>
+        </w:rPr>
+        <w:t xml:space="preserve">usage</w:t>
+      </w:r>
+      <w:r>
+        <w:t xml:space="preserve">) devuelto por la API en el API route</w:t>
       </w:r>
       <w:r>
         <w:t xml:space="preserve"> </w:t>
@@ -21460,13 +21533,10 @@
         <w:rPr>
           <w:rStyle w:val="VerbatimChar"/>
         </w:rPr>
-        <w:t xml:space="preserve">usageMetadata.totalTokenCount</w:t>
-      </w:r>
-      <w:r>
-        <w:t xml:space="preserve"> </w:t>
-      </w:r>
-      <w:r>
-        <w:t xml:space="preserve">de la respuesta de la API.</w:t>
+        <w:t xml:space="preserve">/api/chatbot</w:t>
+      </w:r>
+      <w:r>
+        <w:t xml:space="preserve">.</w:t>
       </w:r>
     </w:p>
     <w:p>
@@ -21566,7 +21636,19 @@
         <w:pStyle w:val="Heading2"/>
       </w:pPr>
       <w:r>
-        <w:t xml:space="preserve">11.2 Consumo del Chatbot (Google Gemini 2.5 Flash)</w:t>
+        <w:t xml:space="preserve">11.2 Consumo del Chatbot (DeepSeek</w:t>
+      </w:r>
+      <w:r>
+        <w:t xml:space="preserve"> </w:t>
+      </w:r>
+      <w:r>
+        <w:rPr>
+          <w:rStyle w:val="VerbatimChar"/>
+        </w:rPr>
+        <w:t xml:space="preserve">deepseek-chat</w:t>
+      </w:r>
+      <w:r>
+        <w:t xml:space="preserve">)</w:t>
       </w:r>
     </w:p>
     <w:tbl>
@@ -21920,7 +22002,19 @@
         <w:pStyle w:val="ImageCaption"/>
       </w:pPr>
       <w:r>
-        <w:t xml:space="preserve">Tabla 30: Consumo de tokens por tipo de consulta del chatbot (Gemini 2.5 Flash, thinkingBudget: 0)</w:t>
+        <w:t xml:space="preserve">Tabla 30: Consumo de tokens por tipo de consulta del chatbot (DeepSeek</w:t>
+      </w:r>
+      <w:r>
+        <w:t xml:space="preserve"> </w:t>
+      </w:r>
+      <w:r>
+        <w:rPr>
+          <w:rStyle w:val="VerbatimChar"/>
+        </w:rPr>
+        <w:t xml:space="preserve">deepseek-chat</w:t>
+      </w:r>
+      <w:r>
+        <w:t xml:space="preserve">, max_tokens: 300)</w:t>
       </w:r>
     </w:p>
     <w:p>
@@ -21938,7 +22032,7 @@
         <w:t xml:space="preserve"> </w:t>
       </w:r>
       <w:r>
-        <w:t xml:space="preserve"> 130 tokens totales (promedio). A 100 mensajes/día:  13,000 tokens/día, muy por debajo del límite gratuito de Google Gemini.</w:t>
+        <w:t xml:space="preserve"> 130 tokens totales (promedio). A 100 mensajes/día:  13,000 tokens/día, un volumen bajo con costo mínimo en DeepSeek.</w:t>
       </w:r>
     </w:p>
     <w:bookmarkEnd w:id="175"/>
@@ -22562,19 +22656,19 @@
                     <w:jc w:val="center"/>
                   </w:pPr>
                   <w:r>
-                    <w:t xml:space="preserve">Tokens ahorrados (thinkingBudget: 0, chatbot)</w:t>
-                  </w:r>
-                </w:p>
-              </w:tc>
-              <w:tc>
-                <w:tcPr/>
-                <w:p>
-                  <w:pPr>
-                    <w:pStyle w:val="Compact"/>
-                    <w:jc w:val="center"/>
-                  </w:pPr>
-                  <w:r>
-                    <w:t xml:space="preserve"> 100% tokens de razonamiento</w:t>
+                    <w:t xml:space="preserve">Límite de salida (max_tokens: 300, chatbot)</w:t>
+                  </w:r>
+                </w:p>
+              </w:tc>
+              <w:tc>
+                <w:tcPr/>
+                <w:p>
+                  <w:pPr>
+                    <w:pStyle w:val="Compact"/>
+                    <w:jc w:val="center"/>
+                  </w:pPr>
+                  <w:r>
+                    <w:t xml:space="preserve">Evita respuestas largas</w:t>
                   </w:r>
                 </w:p>
               </w:tc>
@@ -22615,13 +22709,13 @@
           <w:b/>
           <w:bCs/>
         </w:rPr>
-        <w:t xml:space="preserve">Thinking budget desactivado (chatbot):</w:t>
+        <w:t xml:space="preserve">Salida acotada (chatbot):</w:t>
       </w:r>
       <w:r>
         <w:t xml:space="preserve"> </w:t>
       </w:r>
       <w:r>
-        <w:t xml:space="preserve">Gemini 2.5 Flash tiene modo de razonamiento por defecto. Configurar</w:t>
+        <w:t xml:space="preserve">el API route limita</w:t>
       </w:r>
       <w:r>
         <w:t xml:space="preserve"> </w:t>
@@ -22630,13 +22724,13 @@
         <w:rPr>
           <w:rStyle w:val="VerbatimChar"/>
         </w:rPr>
-        <w:t xml:space="preserve">thinkingBudget: 0</w:t>
+        <w:t xml:space="preserve">max_tokens</w:t>
       </w:r>
       <w:r>
         <w:t xml:space="preserve"> </w:t>
       </w:r>
       <w:r>
-        <w:t xml:space="preserve">elimina tokens de razonamiento sin perder calidad en respuestas simples de soporte.</w:t>
+        <w:t xml:space="preserve">a 300 y usa un system prompt conciso, manteniendo respuestas cortas y baratas.</w:t>
       </w:r>
     </w:p>
     <w:p>
@@ -22739,7 +22833,7 @@
         <w:t xml:space="preserve"> </w:t>
       </w:r>
       <w:r>
-        <w:t xml:space="preserve">en OpenCode para desarrollo y</w:t>
+        <w:t xml:space="preserve">en OpenCode para desarrollo y el campo</w:t>
       </w:r>
       <w:r>
         <w:t xml:space="preserve"> </w:t>
@@ -22754,7 +22848,7 @@
         <w:t xml:space="preserve"> </w:t>
       </w:r>
       <w:r>
-        <w:t xml:space="preserve">en respuestas de Google Gemini para el chatbot.</w:t>
+        <w:t xml:space="preserve">en las respuestas de DeepSeek para el chatbot.</w:t>
       </w:r>
     </w:p>
     <w:bookmarkEnd w:id="178"/>
@@ -22772,7 +22866,7 @@
         <w:pStyle w:val="FirstParagraph"/>
       </w:pPr>
       <w:r>
-        <w:t xml:space="preserve">La combinación de Google Gemini (modelo económico con tier gratuito generoso) con optimización de tokens (thinkingBudget: 0 + Caveman + Ponytail) mantiene el consumo muy por debajo de los límites gratuitos. El chatbot gasta  140 tokens por mensaje vs  250 con thinking activado, una reducción del 44% que hace sostenible el uso continuo.</w:t>
+        <w:t xml:space="preserve">La combinación de DeepSeek (modelo económico) con optimización de tokens (Caveman + Ponytail en desarrollo, salida acotada en el chatbot) mantiene el consumo bajo y sostenible. El chatbot gasta  130 tokens por mensaje, un costo mínimo para uso continuo.</w:t>
       </w:r>
     </w:p>
     <w:bookmarkEnd w:id="179"/>
@@ -23206,7 +23300,7 @@
               <a:graphicData uri="http://schemas.openxmlformats.org/drawingml/2006/picture">
                 <pic:pic>
                   <pic:nvPicPr>
-                    <pic:cNvPr descr="/tmp/tmp9qb_82x6/img-18.png" id="187" name="Picture"/>
+                    <pic:cNvPr descr="/tmp/tmpemujarvy/img-18.png" id="187" name="Picture"/>
                     <pic:cNvPicPr>
                       <a:picLocks noChangeArrowheads="1" noChangeAspect="1"/>
                     </pic:cNvPicPr>
@@ -24759,7 +24853,7 @@
               <a:graphicData uri="http://schemas.openxmlformats.org/drawingml/2006/picture">
                 <pic:pic>
                   <pic:nvPicPr>
-                    <pic:cNvPr descr="/tmp/tmp9qb_82x6/img-19.png" id="198" name="Picture"/>
+                    <pic:cNvPr descr="/tmp/tmpemujarvy/img-19.png" id="198" name="Picture"/>
                     <pic:cNvPicPr>
                       <a:picLocks noChangeArrowheads="1" noChangeAspect="1"/>
                     </pic:cNvPicPr>
@@ -24841,7 +24935,7 @@
               <a:graphicData uri="http://schemas.openxmlformats.org/drawingml/2006/picture">
                 <pic:pic>
                   <pic:nvPicPr>
-                    <pic:cNvPr descr="/tmp/tmp9qb_82x6/img-20.png" id="202" name="Picture"/>
+                    <pic:cNvPr descr="/tmp/tmpemujarvy/img-20.png" id="202" name="Picture"/>
                     <pic:cNvPicPr>
                       <a:picLocks noChangeArrowheads="1" noChangeAspect="1"/>
                     </pic:cNvPicPr>
@@ -24906,7 +25000,7 @@
               <a:graphicData uri="http://schemas.openxmlformats.org/drawingml/2006/picture">
                 <pic:pic>
                   <pic:nvPicPr>
-                    <pic:cNvPr descr="/tmp/tmp9qb_82x6/img-21.png" id="206" name="Picture"/>
+                    <pic:cNvPr descr="/tmp/tmpemujarvy/img-21.png" id="206" name="Picture"/>
                     <pic:cNvPicPr>
                       <a:picLocks noChangeArrowheads="1" noChangeAspect="1"/>
                     </pic:cNvPicPr>
@@ -24971,7 +25065,7 @@
               <a:graphicData uri="http://schemas.openxmlformats.org/drawingml/2006/picture">
                 <pic:pic>
                   <pic:nvPicPr>
-                    <pic:cNvPr descr="/tmp/tmp9qb_82x6/img-22.png" id="210" name="Picture"/>
+                    <pic:cNvPr descr="/tmp/tmpemujarvy/img-22.png" id="210" name="Picture"/>
                     <pic:cNvPicPr>
                       <a:picLocks noChangeArrowheads="1" noChangeAspect="1"/>
                     </pic:cNvPicPr>
@@ -25036,7 +25130,7 @@
               <a:graphicData uri="http://schemas.openxmlformats.org/drawingml/2006/picture">
                 <pic:pic>
                   <pic:nvPicPr>
-                    <pic:cNvPr descr="/tmp/tmp9qb_82x6/img-23.png" id="214" name="Picture"/>
+                    <pic:cNvPr descr="/tmp/tmpemujarvy/img-23.png" id="214" name="Picture"/>
                     <pic:cNvPicPr>
                       <a:picLocks noChangeArrowheads="1" noChangeAspect="1"/>
                     </pic:cNvPicPr>

</xml_diff>